<commit_message>
feat: Update SEO/OGP settings and app icons
</commit_message>
<xml_diff>
--- a/update_UI/templates/chapter_fixed.docx
+++ b/update_UI/templates/chapter_fixed.docx
@@ -5,7 +5,6 @@
     <w:p>
       <w:pPr>
         <w:rPr>
-          <w:rFonts w:hint="eastAsia"/>
           <w:b/>
           <w:bCs/>
           <w:sz w:val="24"/>
@@ -279,25 +278,7 @@
           <w:sz w:val="21"/>
           <w:szCs w:val="21"/>
         </w:rPr>
-        <w:t xml:space="preserve">{% for block in </w:t>
-      </w:r>
-      <w:proofErr w:type="spellStart"/>
-      <w:proofErr w:type="gramStart"/>
-      <w:r>
-        <w:rPr>
-          <w:sz w:val="21"/>
-          <w:szCs w:val="21"/>
-        </w:rPr>
-        <w:t>exp.blocks</w:t>
-      </w:r>
-      <w:proofErr w:type="spellEnd"/>
-      <w:proofErr w:type="gramEnd"/>
-      <w:r>
-        <w:rPr>
-          <w:sz w:val="21"/>
-          <w:szCs w:val="21"/>
-        </w:rPr>
-        <w:t xml:space="preserve"> %}</w:t>
+        <w:t>4</w:t>
       </w:r>
     </w:p>
     <w:p>
@@ -337,7 +318,6 @@
       <w:pPr>
         <w:jc w:val="center"/>
         <w:rPr>
-          <w:rFonts w:hint="eastAsia"/>
           <w:sz w:val="21"/>
           <w:szCs w:val="21"/>
         </w:rPr>
@@ -619,7 +599,6 @@
       <w:pPr>
         <w:jc w:val="center"/>
         <w:rPr>
-          <w:rFonts w:hint="eastAsia"/>
           <w:sz w:val="21"/>
           <w:szCs w:val="21"/>
         </w:rPr>
@@ -893,7 +872,6 @@
     <w:p>
       <w:pPr>
         <w:rPr>
-          <w:rFonts w:hint="eastAsia"/>
           <w:b/>
           <w:bCs/>
           <w:sz w:val="24"/>
@@ -1032,7 +1010,6 @@
     <w:p>
       <w:pPr>
         <w:rPr>
-          <w:rFonts w:hint="eastAsia"/>
           <w:b/>
           <w:bCs/>
           <w:sz w:val="24"/>
@@ -1123,7 +1100,6 @@
     <w:p>
       <w:pPr>
         <w:rPr>
-          <w:rFonts w:hint="eastAsia"/>
           <w:b/>
           <w:bCs/>
           <w:sz w:val="24"/>

</xml_diff>